<commit_message>
docs(konzepte): Abgabe-Fassung - Statushinweis raus, echte Umlaute durchgaengig
Zwei Korrekturen fuer die Pitch-/Abgabe-Lesbarkeit:

1. Der gelbe "Hinweis zur Lesart"-Block am Dokumentanfang ist entfernt.
   Die Schwesterdatei-Information lebt in docs/konzepte/README.md und
   reicht dort, das Dokument selbst soll clean praesentierbar sein.

2. Alle ae/oe/ue-Ersatzschreibungen sind durch echte Umlaute
   (ae->ae, oe->oe, ue->ue) ersetzt. Konsistent durch das ganze Dokument,
   einschliesslich Heading-Texten und Tabelleninhalten.
</commit_message>
<xml_diff>
--- a/docs/konzepte/MS5_Testkonzept_G15_Abgabe.docx
+++ b/docs/konzepte/MS5_Testkonzept_G15_Abgabe.docx
@@ -48,75 +48,6 @@
         <w:t xml:space="preserve">SoPra SoSe 2026 — Gruppe 15 — Adventure Bike ERP</w:t>
       </w:r>
     </w:p>
-    <w:tbl>
-      <w:tblPr>
-        <w:tblW w:type="dxa" w:w="9026"/>
-        <w:tblBorders>
-          <w:top w:val="single" w:color="auto" w:sz="4"/>
-          <w:left w:val="single" w:color="auto" w:sz="4"/>
-          <w:bottom w:val="single" w:color="auto" w:sz="4"/>
-          <w:right w:val="single" w:color="auto" w:sz="4"/>
-          <w:insideH w:val="single" w:color="auto" w:sz="4"/>
-          <w:insideV w:val="single" w:color="auto" w:sz="4"/>
-        </w:tblBorders>
-      </w:tblPr>
-      <w:tblGrid>
-        <w:gridCol w:w="9026"/>
-      </w:tblGrid>
-      <w:tr>
-        <w:tc>
-          <w:tcPr>
-            <w:tcW w:type="dxa" w:w="9026"/>
-            <w:tcBorders>
-              <w:top w:val="single" w:color="BFBFBF" w:sz="4"/>
-              <w:left w:val="single" w:color="BFBFBF" w:sz="4"/>
-              <w:bottom w:val="single" w:color="BFBFBF" w:sz="4"/>
-              <w:right w:val="single" w:color="BFBFBF" w:sz="4"/>
-            </w:tcBorders>
-            <w:shd w:fill="FFF2CC" w:val="clear"/>
-            <w:tcMar>
-              <w:top w:type="dxa" w:w="120"/>
-              <w:left w:type="dxa" w:w="200"/>
-              <w:bottom w:type="dxa" w:w="120"/>
-              <w:right w:type="dxa" w:w="200"/>
-            </w:tcMar>
-          </w:tcPr>
-          <w:p>
-            <w:pPr>
-              <w:spacing w:after="60" w:before="0"/>
-            </w:pPr>
-            <w:r>
-              <w:rPr>
-                <w:rFonts w:ascii="Calibri" w:cs="Calibri" w:eastAsia="Calibri" w:hAnsi="Calibri"/>
-                <w:b/>
-                <w:bCs/>
-                <w:sz w:val="22"/>
-                <w:szCs w:val="22"/>
-              </w:rPr>
-              <w:t xml:space="preserve">Hinweis zur Lesart</w:t>
-            </w:r>
-          </w:p>
-          <w:p>
-            <w:pPr>
-              <w:spacing w:after="0" w:before="0"/>
-            </w:pPr>
-            <w:r>
-              <w:rPr>
-                <w:rFonts w:ascii="Calibri" w:cs="Calibri" w:eastAsia="Calibri" w:hAnsi="Calibri"/>
-                <w:sz w:val="22"/>
-                <w:szCs w:val="22"/>
-              </w:rPr>
-              <w:t xml:space="preserve">Dies ist die kompakte Abgabe- und Praesentationsfassung. Die ausfuehrliche technische Version mit Test-IDs, SPC-Tabelle und konkreten DB-Objekten liegt im Repo unter docs/konzepte/MS5_Testkonzept_G15_Intern.docx. Beide Dokumente beschreiben den gleichen Stand vom 2026-06-08.</w:t>
-            </w:r>
-          </w:p>
-        </w:tc>
-      </w:tr>
-    </w:tbl>
-    <w:p>
-      <w:r>
-        <w:t xml:space="preserve"/>
-      </w:r>
-    </w:p>
     <w:p>
       <w:pPr>
         <w:pStyle w:val="Heading1"/>
@@ -179,61 +110,61 @@
           <w:sz w:val="22"/>
           <w:szCs w:val="22"/>
         </w:rPr>
-        <w:t xml:space="preserve">Zahllast und Vorsteuerueberhang gemaess unserer Konvention nachvollziehbar berechnet werden,</w:t>
-      </w:r>
-    </w:p>
-    <w:p>
-      <w:pPr>
-        <w:pStyle w:val="ListParagraph"/>
-        <w:numPr>
-          <w:ilvl w:val="0"/>
-          <w:numId w:val="2"/>
-        </w:numPr>
-        <w:spacing w:after="40" w:before="40"/>
-      </w:pPr>
-      <w:r>
-        <w:rPr>
-          <w:rFonts w:ascii="Calibri" w:cs="Calibri" w:eastAsia="Calibri" w:hAnsi="Calibri"/>
-          <w:sz w:val="22"/>
-          <w:szCs w:val="22"/>
-        </w:rPr>
-        <w:t xml:space="preserve">der Status-Workflow (Entwurf, Freigabe, Auszahlung) rollenrichtig und unveraenderlich abgeschlossen wird,</w:t>
-      </w:r>
-    </w:p>
-    <w:p>
-      <w:pPr>
-        <w:pStyle w:val="ListParagraph"/>
-        <w:numPr>
-          <w:ilvl w:val="0"/>
-          <w:numId w:val="2"/>
-        </w:numPr>
-        <w:spacing w:after="40" w:before="40"/>
-      </w:pPr>
-      <w:r>
-        <w:rPr>
-          <w:rFonts w:ascii="Calibri" w:cs="Calibri" w:eastAsia="Calibri" w:hAnsi="Calibri"/>
-          <w:sz w:val="22"/>
-          <w:szCs w:val="22"/>
-        </w:rPr>
-        <w:t xml:space="preserve">Skonto- und Korrekturfaelle, soweit von den Partnergruppen geliefert, periodenrichtig einfliessen,</w:t>
-      </w:r>
-    </w:p>
-    <w:p>
-      <w:pPr>
-        <w:pStyle w:val="ListParagraph"/>
-        <w:numPr>
-          <w:ilvl w:val="0"/>
-          <w:numId w:val="2"/>
-        </w:numPr>
-        <w:spacing w:after="40" w:before="40"/>
-      </w:pPr>
-      <w:r>
-        <w:rPr>
-          <w:rFonts w:ascii="Calibri" w:cs="Calibri" w:eastAsia="Calibri" w:hAnsi="Calibri"/>
-          <w:sz w:val="22"/>
-          <w:szCs w:val="22"/>
-        </w:rPr>
-        <w:t xml:space="preserve">die Loesung stabil und performant bleibt, auch wenn Partnergruppen ihre Schnittstellen aendern,</w:t>
+        <w:t xml:space="preserve">Zahllast und Vorsteuerüberhang gemäss unserer Konvention nachvollziehbar berechnet werden,</w:t>
+      </w:r>
+    </w:p>
+    <w:p>
+      <w:pPr>
+        <w:pStyle w:val="ListParagraph"/>
+        <w:numPr>
+          <w:ilvl w:val="0"/>
+          <w:numId w:val="2"/>
+        </w:numPr>
+        <w:spacing w:after="40" w:before="40"/>
+      </w:pPr>
+      <w:r>
+        <w:rPr>
+          <w:rFonts w:ascii="Calibri" w:cs="Calibri" w:eastAsia="Calibri" w:hAnsi="Calibri"/>
+          <w:sz w:val="22"/>
+          <w:szCs w:val="22"/>
+        </w:rPr>
+        <w:t xml:space="preserve">der Status-Workflow (Entwurf, Freigabe, Auszahlung) rollenrichtig und unveränderlich abgeschlossen wird,</w:t>
+      </w:r>
+    </w:p>
+    <w:p>
+      <w:pPr>
+        <w:pStyle w:val="ListParagraph"/>
+        <w:numPr>
+          <w:ilvl w:val="0"/>
+          <w:numId w:val="2"/>
+        </w:numPr>
+        <w:spacing w:after="40" w:before="40"/>
+      </w:pPr>
+      <w:r>
+        <w:rPr>
+          <w:rFonts w:ascii="Calibri" w:cs="Calibri" w:eastAsia="Calibri" w:hAnsi="Calibri"/>
+          <w:sz w:val="22"/>
+          <w:szCs w:val="22"/>
+        </w:rPr>
+        <w:t xml:space="preserve">Skonto- und Korrekturfälle, soweit von den Partnergruppen geliefert, periodenrichtig einfliessen,</w:t>
+      </w:r>
+    </w:p>
+    <w:p>
+      <w:pPr>
+        <w:pStyle w:val="ListParagraph"/>
+        <w:numPr>
+          <w:ilvl w:val="0"/>
+          <w:numId w:val="2"/>
+        </w:numPr>
+        <w:spacing w:after="40" w:before="40"/>
+      </w:pPr>
+      <w:r>
+        <w:rPr>
+          <w:rFonts w:ascii="Calibri" w:cs="Calibri" w:eastAsia="Calibri" w:hAnsi="Calibri"/>
+          <w:sz w:val="22"/>
+          <w:szCs w:val="22"/>
+        </w:rPr>
+        <w:t xml:space="preserve">die Lösung stabil und performant bleibt, auch wenn Partnergruppen ihre Schnittstellen ändern,</w:t>
       </w:r>
     </w:p>
     <w:p>
@@ -298,25 +229,25 @@
           <w:sz w:val="22"/>
           <w:szCs w:val="22"/>
         </w:rPr>
-        <w:t xml:space="preserve">Datenbank-Funktionen und Stored Procedures fuer Periodenpruefung, Saldoberechnung, Anlage, Freigabe, Auszahlung und Rueckweisung,</w:t>
-      </w:r>
-    </w:p>
-    <w:p>
-      <w:pPr>
-        <w:pStyle w:val="ListParagraph"/>
-        <w:numPr>
-          <w:ilvl w:val="0"/>
-          <w:numId w:val="2"/>
-        </w:numPr>
-        <w:spacing w:after="40" w:before="40"/>
-      </w:pPr>
-      <w:r>
-        <w:rPr>
-          <w:rFonts w:ascii="Calibri" w:cs="Calibri" w:eastAsia="Calibri" w:hAnsi="Calibri"/>
-          <w:sz w:val="22"/>
-          <w:szCs w:val="22"/>
-        </w:rPr>
-        <w:t xml:space="preserve">eigene Tabellen fuer die Abrechnung und ihre Detailzeilen,</w:t>
+        <w:t xml:space="preserve">Datenbank-Funktionen und Stored Procedures für Periodenprüfung, Saldoberechnung, Anlage, Freigabe, Auszahlung und Rückweisung,</w:t>
+      </w:r>
+    </w:p>
+    <w:p>
+      <w:pPr>
+        <w:pStyle w:val="ListParagraph"/>
+        <w:numPr>
+          <w:ilvl w:val="0"/>
+          <w:numId w:val="2"/>
+        </w:numPr>
+        <w:spacing w:after="40" w:before="40"/>
+      </w:pPr>
+      <w:r>
+        <w:rPr>
+          <w:rFonts w:ascii="Calibri" w:cs="Calibri" w:eastAsia="Calibri" w:hAnsi="Calibri"/>
+          <w:sz w:val="22"/>
+          <w:szCs w:val="22"/>
+        </w:rPr>
+        <w:t xml:space="preserve">eigene Tabellen für die Abrechnung und ihre Detailzeilen,</w:t>
       </w:r>
     </w:p>
     <w:p>
@@ -352,7 +283,7 @@
           <w:sz w:val="22"/>
           <w:szCs w:val="22"/>
         </w:rPr>
-        <w:t xml:space="preserve">Streamlit-Frontend mit den Seiten Uebersicht, Neue Abrechnung, Detail.</w:t>
+        <w:t xml:space="preserve">Streamlit-Frontend mit den Seiten Übersicht, Neue Abrechnung, Detail.</w:t>
       </w:r>
     </w:p>
     <w:p>
@@ -365,7 +296,7 @@
           <w:sz w:val="22"/>
           <w:szCs w:val="22"/>
         </w:rPr>
-        <w:t xml:space="preserve">Die Tabellen der Nachbargruppen (Eingangs- und Ausgangsrechnungen, Zahlungseingaenge, Status- und Benutzertabellen) werden nur lesend genutzt und sind nicht selbst Testobjekt.</w:t>
+        <w:t xml:space="preserve">Die Tabellen der Nachbargruppen (Eingangs- und Ausgangsrechnungen, Zahlungseingänge, Status- und Benutzertabellen) werden nur lesend genutzt und sind nicht selbst Testobjekt.</w:t>
       </w:r>
     </w:p>
     <w:p>
@@ -420,7 +351,7 @@
           <w:sz w:val="22"/>
           <w:szCs w:val="22"/>
         </w:rPr>
-        <w:t xml:space="preserve"> Pruefung einzelner T-SQL-Bausteine isoliert.</w:t>
+        <w:t xml:space="preserve"> Prüfung einzelner T-SQL-Bausteine isoliert.</w:t>
       </w:r>
     </w:p>
     <w:p>
@@ -479,7 +410,7 @@
           <w:sz w:val="22"/>
           <w:szCs w:val="22"/>
         </w:rPr>
-        <w:t xml:space="preserve">ueberwiegender Umsatzsteuer (Zahllast)</w:t>
+        <w:t xml:space="preserve">überwiegender Umsatzsteuer (Zahllast)</w:t>
       </w:r>
     </w:p>
     <w:p>
@@ -497,7 +428,7 @@
           <w:sz w:val="22"/>
           <w:szCs w:val="22"/>
         </w:rPr>
-        <w:t xml:space="preserve">ueberwiegender Vorsteuer (Ueberhang)</w:t>
+        <w:t xml:space="preserve">überwiegender Vorsteuer (Überhang)</w:t>
       </w:r>
     </w:p>
     <w:p>
@@ -533,25 +464,25 @@
           <w:sz w:val="22"/>
           <w:szCs w:val="22"/>
         </w:rPr>
-        <w:t xml:space="preserve">Randfaellen wie beide Werte null</w:t>
-      </w:r>
-    </w:p>
-    <w:p>
-      <w:pPr>
-        <w:pStyle w:val="ListParagraph"/>
-        <w:numPr>
-          <w:ilvl w:val="0"/>
-          <w:numId w:val="2"/>
-        </w:numPr>
-        <w:spacing w:after="40" w:before="40"/>
-      </w:pPr>
-      <w:r>
-        <w:rPr>
-          <w:rFonts w:ascii="Calibri" w:cs="Calibri" w:eastAsia="Calibri" w:hAnsi="Calibri"/>
-          <w:sz w:val="22"/>
-          <w:szCs w:val="22"/>
-        </w:rPr>
-        <w:t xml:space="preserve">Periodenpruefung:</w:t>
+        <w:t xml:space="preserve">Randfällen wie beide Werte null</w:t>
+      </w:r>
+    </w:p>
+    <w:p>
+      <w:pPr>
+        <w:pStyle w:val="ListParagraph"/>
+        <w:numPr>
+          <w:ilvl w:val="0"/>
+          <w:numId w:val="2"/>
+        </w:numPr>
+        <w:spacing w:after="40" w:before="40"/>
+      </w:pPr>
+      <w:r>
+        <w:rPr>
+          <w:rFonts w:ascii="Calibri" w:cs="Calibri" w:eastAsia="Calibri" w:hAnsi="Calibri"/>
+          <w:sz w:val="22"/>
+          <w:szCs w:val="22"/>
+        </w:rPr>
+        <w:t xml:space="preserve">Periodenprüfung:</w:t>
       </w:r>
     </w:p>
     <w:p>
@@ -569,7 +500,7 @@
           <w:sz w:val="22"/>
           <w:szCs w:val="22"/>
         </w:rPr>
-        <w:t xml:space="preserve">zu frueher Aufruf vor dem 10. des Folgemonats</w:t>
+        <w:t xml:space="preserve">zu früher Aufruf vor dem 10. des Folgemonats</w:t>
       </w:r>
     </w:p>
     <w:p>
@@ -605,25 +536,25 @@
           <w:sz w:val="22"/>
           <w:szCs w:val="22"/>
         </w:rPr>
-        <w:t xml:space="preserve">ungueltige Periodenformate</w:t>
-      </w:r>
-    </w:p>
-    <w:p>
-      <w:pPr>
-        <w:pStyle w:val="ListParagraph"/>
-        <w:numPr>
-          <w:ilvl w:val="0"/>
-          <w:numId w:val="2"/>
-        </w:numPr>
-        <w:spacing w:after="40" w:before="40"/>
-      </w:pPr>
-      <w:r>
-        <w:rPr>
-          <w:rFonts w:ascii="Calibri" w:cs="Calibri" w:eastAsia="Calibri" w:hAnsi="Calibri"/>
-          <w:sz w:val="22"/>
-          <w:szCs w:val="22"/>
-        </w:rPr>
-        <w:t xml:space="preserve">Rollenpruefung beim Statuswechsel.</w:t>
+        <w:t xml:space="preserve">ungültige Periodenformate</w:t>
+      </w:r>
+    </w:p>
+    <w:p>
+      <w:pPr>
+        <w:pStyle w:val="ListParagraph"/>
+        <w:numPr>
+          <w:ilvl w:val="0"/>
+          <w:numId w:val="2"/>
+        </w:numPr>
+        <w:spacing w:after="40" w:before="40"/>
+      </w:pPr>
+      <w:r>
+        <w:rPr>
+          <w:rFonts w:ascii="Calibri" w:cs="Calibri" w:eastAsia="Calibri" w:hAnsi="Calibri"/>
+          <w:sz w:val="22"/>
+          <w:szCs w:val="22"/>
+        </w:rPr>
+        <w:t xml:space="preserve">Rollenprüfung beim Statuswechsel.</w:t>
       </w:r>
     </w:p>
     <w:p>
@@ -744,43 +675,43 @@
           <w:sz w:val="22"/>
           <w:szCs w:val="22"/>
         </w:rPr>
-        <w:t xml:space="preserve">Vollstaendiger Durchlauf: Anlage einer Abrechnung, Freigabe, Auszahlung.</w:t>
-      </w:r>
-    </w:p>
-    <w:p>
-      <w:pPr>
-        <w:pStyle w:val="ListParagraph"/>
-        <w:numPr>
-          <w:ilvl w:val="0"/>
-          <w:numId w:val="2"/>
-        </w:numPr>
-        <w:spacing w:after="40" w:before="40"/>
-      </w:pPr>
-      <w:r>
-        <w:rPr>
-          <w:rFonts w:ascii="Calibri" w:cs="Calibri" w:eastAsia="Calibri" w:hAnsi="Calibri"/>
-          <w:sz w:val="22"/>
-          <w:szCs w:val="22"/>
-        </w:rPr>
-        <w:t xml:space="preserve">Rueckgabe-Pfad: nach einer Freigabe zurueck in den Entwurf, neu berechnen, erneut freigeben.</w:t>
-      </w:r>
-    </w:p>
-    <w:p>
-      <w:pPr>
-        <w:pStyle w:val="ListParagraph"/>
-        <w:numPr>
-          <w:ilvl w:val="0"/>
-          <w:numId w:val="2"/>
-        </w:numPr>
-        <w:spacing w:after="40" w:before="40"/>
-      </w:pPr>
-      <w:r>
-        <w:rPr>
-          <w:rFonts w:ascii="Calibri" w:cs="Calibri" w:eastAsia="Calibri" w:hAnsi="Calibri"/>
-          <w:sz w:val="22"/>
-          <w:szCs w:val="22"/>
-        </w:rPr>
-        <w:t xml:space="preserve">Uebernahme der Belege aus den Lese-Views in die Abrechnungs-Detailtabelle.</w:t>
+        <w:t xml:space="preserve">Vollständiger Durchlauf: Anlage einer Abrechnung, Freigabe, Auszahlung.</w:t>
+      </w:r>
+    </w:p>
+    <w:p>
+      <w:pPr>
+        <w:pStyle w:val="ListParagraph"/>
+        <w:numPr>
+          <w:ilvl w:val="0"/>
+          <w:numId w:val="2"/>
+        </w:numPr>
+        <w:spacing w:after="40" w:before="40"/>
+      </w:pPr>
+      <w:r>
+        <w:rPr>
+          <w:rFonts w:ascii="Calibri" w:cs="Calibri" w:eastAsia="Calibri" w:hAnsi="Calibri"/>
+          <w:sz w:val="22"/>
+          <w:szCs w:val="22"/>
+        </w:rPr>
+        <w:t xml:space="preserve">Rückgabe-Pfad: nach einer Freigabe zurück in den Entwurf, neu berechnen, erneut freigeben.</w:t>
+      </w:r>
+    </w:p>
+    <w:p>
+      <w:pPr>
+        <w:pStyle w:val="ListParagraph"/>
+        <w:numPr>
+          <w:ilvl w:val="0"/>
+          <w:numId w:val="2"/>
+        </w:numPr>
+        <w:spacing w:after="40" w:before="40"/>
+      </w:pPr>
+      <w:r>
+        <w:rPr>
+          <w:rFonts w:ascii="Calibri" w:cs="Calibri" w:eastAsia="Calibri" w:hAnsi="Calibri"/>
+          <w:sz w:val="22"/>
+          <w:szCs w:val="22"/>
+        </w:rPr>
+        <w:t xml:space="preserve">Übernahme der Belege aus den Lese-Views in die Abrechnungs-Detailtabelle.</w:t>
       </w:r>
     </w:p>
     <w:p>
@@ -816,25 +747,25 @@
           <w:sz w:val="22"/>
           <w:szCs w:val="22"/>
         </w:rPr>
-        <w:t xml:space="preserve">Spaete Korrektur durch eine Zahlung mit Skonto fliesst in die naechste offene Periode.</w:t>
-      </w:r>
-    </w:p>
-    <w:p>
-      <w:pPr>
-        <w:pStyle w:val="ListParagraph"/>
-        <w:numPr>
-          <w:ilvl w:val="0"/>
-          <w:numId w:val="2"/>
-        </w:numPr>
-        <w:spacing w:after="40" w:before="40"/>
-      </w:pPr>
-      <w:r>
-        <w:rPr>
-          <w:rFonts w:ascii="Calibri" w:cs="Calibri" w:eastAsia="Calibri" w:hAnsi="Calibri"/>
-          <w:sz w:val="22"/>
-          <w:szCs w:val="22"/>
-        </w:rPr>
-        <w:t xml:space="preserve">Zusammenspiel von Frontend und Datenbank fuer die Anlage einer neuen Abrechnung, inklusive Fehleranzeige bei ungueltigem Aufruf.</w:t>
+        <w:t xml:space="preserve">Späte Korrektur durch eine Zahlung mit Skonto fliesst in die nächste offene Periode.</w:t>
+      </w:r>
+    </w:p>
+    <w:p>
+      <w:pPr>
+        <w:pStyle w:val="ListParagraph"/>
+        <w:numPr>
+          <w:ilvl w:val="0"/>
+          <w:numId w:val="2"/>
+        </w:numPr>
+        <w:spacing w:after="40" w:before="40"/>
+      </w:pPr>
+      <w:r>
+        <w:rPr>
+          <w:rFonts w:ascii="Calibri" w:cs="Calibri" w:eastAsia="Calibri" w:hAnsi="Calibri"/>
+          <w:sz w:val="22"/>
+          <w:szCs w:val="22"/>
+        </w:rPr>
+        <w:t xml:space="preserve">Zusammenspiel von Frontend und Datenbank für die Anlage einer neuen Abrechnung, inklusive Fehleranzeige bei ungültigem Aufruf.</w:t>
       </w:r>
     </w:p>
     <w:p>
@@ -891,7 +822,7 @@
           <w:sz w:val="22"/>
           <w:szCs w:val="22"/>
         </w:rPr>
-        <w:t xml:space="preserve">Periode = leer oder ungueltig (zum Beispiel "2026-13")</w:t>
+        <w:t xml:space="preserve">Periode = leer oder ungültig (zum Beispiel "2026-13")</w:t>
       </w:r>
     </w:p>
     <w:p>
@@ -1020,7 +951,7 @@
           <w:sz w:val="22"/>
           <w:szCs w:val="22"/>
         </w:rPr>
-        <w:t xml:space="preserve"> Absicherung bei Aenderungen am Code oder an den Quellen der Nachbargruppen.</w:t>
+        <w:t xml:space="preserve"> Absicherung bei Änderungen am Code oder an den Quellen der Nachbargruppen.</w:t>
       </w:r>
     </w:p>
     <w:p>
@@ -1061,25 +992,25 @@
           <w:sz w:val="22"/>
           <w:szCs w:val="22"/>
         </w:rPr>
-        <w:t xml:space="preserve">Wenn eine Partnergruppe ihre Quellstruktur aendert, wird primaer die zugehoerige Lese-View angepasst. Prozeduren und Tests sollen unveraendert weiter gruen sein.</w:t>
-      </w:r>
-    </w:p>
-    <w:p>
-      <w:pPr>
-        <w:pStyle w:val="ListParagraph"/>
-        <w:numPr>
-          <w:ilvl w:val="0"/>
-          <w:numId w:val="2"/>
-        </w:numPr>
-        <w:spacing w:after="40" w:before="40"/>
-      </w:pPr>
-      <w:r>
-        <w:rPr>
-          <w:rFonts w:ascii="Calibri" w:cs="Calibri" w:eastAsia="Calibri" w:hAnsi="Calibri"/>
-          <w:sz w:val="22"/>
-          <w:szCs w:val="22"/>
-        </w:rPr>
-        <w:t xml:space="preserve">Nach Index- oder Constraint-Aenderungen muessen die Berechnungsergebnisse identisch bleiben.</w:t>
+        <w:t xml:space="preserve">Wenn eine Partnergruppe ihre Quellstruktur ändert, wird primär die zugehörige Lese-View angepasst. Prozeduren und Tests sollen unverändert weiter grün sein.</w:t>
+      </w:r>
+    </w:p>
+    <w:p>
+      <w:pPr>
+        <w:pStyle w:val="ListParagraph"/>
+        <w:numPr>
+          <w:ilvl w:val="0"/>
+          <w:numId w:val="2"/>
+        </w:numPr>
+        <w:spacing w:after="40" w:before="40"/>
+      </w:pPr>
+      <w:r>
+        <w:rPr>
+          <w:rFonts w:ascii="Calibri" w:cs="Calibri" w:eastAsia="Calibri" w:hAnsi="Calibri"/>
+          <w:sz w:val="22"/>
+          <w:szCs w:val="22"/>
+        </w:rPr>
+        <w:t xml:space="preserve">Nach Index- oder Constraint-Änderungen müssen die Berechnungsergebnisse identisch bleiben.</w:t>
       </w:r>
     </w:p>
     <w:p>
@@ -1136,7 +1067,7 @@
           <w:sz w:val="22"/>
           <w:szCs w:val="22"/>
         </w:rPr>
-        <w:t xml:space="preserve"> Pruefen, dass nur die fachlich zustaendige Rolle den jeweiligen Statuswechsel ausloesen darf.</w:t>
+        <w:t xml:space="preserve"> Prüfen, dass nur die fachlich zuständige Rolle den jeweiligen Statuswechsel auslösen darf.</w:t>
       </w:r>
     </w:p>
     <w:p>
@@ -1195,7 +1126,7 @@
           <w:sz w:val="22"/>
           <w:szCs w:val="22"/>
         </w:rPr>
-        <w:t xml:space="preserve">CFO darf freigeben und zurueckweisen, aber nicht auszahlen.</w:t>
+        <w:t xml:space="preserve">CFO darf freigeben und zurückweisen, aber nicht auszahlen.</w:t>
       </w:r>
     </w:p>
     <w:p>
@@ -1417,43 +1348,43 @@
           <w:sz w:val="22"/>
           <w:szCs w:val="22"/>
         </w:rPr>
-        <w:t xml:space="preserve">Uebersicht zeigt alle bestehenden Abrechnungen mit Status und Saldo.</w:t>
-      </w:r>
-    </w:p>
-    <w:p>
-      <w:pPr>
-        <w:pStyle w:val="ListParagraph"/>
-        <w:numPr>
-          <w:ilvl w:val="0"/>
-          <w:numId w:val="2"/>
-        </w:numPr>
-        <w:spacing w:after="40" w:before="40"/>
-      </w:pPr>
-      <w:r>
-        <w:rPr>
-          <w:rFonts w:ascii="Calibri" w:cs="Calibri" w:eastAsia="Calibri" w:hAnsi="Calibri"/>
-          <w:sz w:val="22"/>
-          <w:szCs w:val="22"/>
-        </w:rPr>
-        <w:t xml:space="preserve">Neue Abrechnung: Periodenauswahl, Anlegen, Rueckmeldung bei Fehlern.</w:t>
-      </w:r>
-    </w:p>
-    <w:p>
-      <w:pPr>
-        <w:pStyle w:val="ListParagraph"/>
-        <w:numPr>
-          <w:ilvl w:val="0"/>
-          <w:numId w:val="2"/>
-        </w:numPr>
-        <w:spacing w:after="40" w:before="40"/>
-      </w:pPr>
-      <w:r>
-        <w:rPr>
-          <w:rFonts w:ascii="Calibri" w:cs="Calibri" w:eastAsia="Calibri" w:hAnsi="Calibri"/>
-          <w:sz w:val="22"/>
-          <w:szCs w:val="22"/>
-        </w:rPr>
-        <w:t xml:space="preserve">Detail: Belege vollstaendig, Status-Aktionen rollenrichtig sichtbar oder ausgegraut, Audit-Spuren sichtbar.</w:t>
+        <w:t xml:space="preserve">Übersicht zeigt alle bestehenden Abrechnungen mit Status und Saldo.</w:t>
+      </w:r>
+    </w:p>
+    <w:p>
+      <w:pPr>
+        <w:pStyle w:val="ListParagraph"/>
+        <w:numPr>
+          <w:ilvl w:val="0"/>
+          <w:numId w:val="2"/>
+        </w:numPr>
+        <w:spacing w:after="40" w:before="40"/>
+      </w:pPr>
+      <w:r>
+        <w:rPr>
+          <w:rFonts w:ascii="Calibri" w:cs="Calibri" w:eastAsia="Calibri" w:hAnsi="Calibri"/>
+          <w:sz w:val="22"/>
+          <w:szCs w:val="22"/>
+        </w:rPr>
+        <w:t xml:space="preserve">Neue Abrechnung: Periodenauswahl, Anlegen, Rückmeldung bei Fehlern.</w:t>
+      </w:r>
+    </w:p>
+    <w:p>
+      <w:pPr>
+        <w:pStyle w:val="ListParagraph"/>
+        <w:numPr>
+          <w:ilvl w:val="0"/>
+          <w:numId w:val="2"/>
+        </w:numPr>
+        <w:spacing w:after="40" w:before="40"/>
+      </w:pPr>
+      <w:r>
+        <w:rPr>
+          <w:rFonts w:ascii="Calibri" w:cs="Calibri" w:eastAsia="Calibri" w:hAnsi="Calibri"/>
+          <w:sz w:val="22"/>
+          <w:szCs w:val="22"/>
+        </w:rPr>
+        <w:t xml:space="preserve">Detail: Belege vollständig, Status-Aktionen rollenrichtig sichtbar oder ausgegraut, Audit-Spuren sichtbar.</w:t>
       </w:r>
     </w:p>
     <w:p>
@@ -1521,7 +1452,7 @@
           <w:sz w:val="22"/>
           <w:szCs w:val="22"/>
         </w:rPr>
-        <w:t xml:space="preserve">Periode mit ueberwiegender Vorsteuer (Ueberhang)</w:t>
+        <w:t xml:space="preserve">Periode mit überwiegender Vorsteuer (Überhang)</w:t>
       </w:r>
     </w:p>
     <w:p>
@@ -1575,25 +1506,25 @@
           <w:sz w:val="22"/>
           <w:szCs w:val="22"/>
         </w:rPr>
-        <w:t xml:space="preserve">Periode mit Skonto- oder Spaetkorrektur, sobald von Gruppe 8 geliefert</w:t>
-      </w:r>
-    </w:p>
-    <w:p>
-      <w:pPr>
-        <w:pStyle w:val="ListParagraph"/>
-        <w:numPr>
-          <w:ilvl w:val="0"/>
-          <w:numId w:val="2"/>
-        </w:numPr>
-        <w:spacing w:after="40" w:before="40"/>
-      </w:pPr>
-      <w:r>
-        <w:rPr>
-          <w:rFonts w:ascii="Calibri" w:cs="Calibri" w:eastAsia="Calibri" w:hAnsi="Calibri"/>
-          <w:sz w:val="22"/>
-          <w:szCs w:val="22"/>
-        </w:rPr>
-        <w:t xml:space="preserve">Grossmengen-Periode fuer Performance-Messungen</w:t>
+        <w:t xml:space="preserve">Periode mit Skonto- oder Spätkorrektur, sobald von Gruppe 8 geliefert</w:t>
+      </w:r>
+    </w:p>
+    <w:p>
+      <w:pPr>
+        <w:pStyle w:val="ListParagraph"/>
+        <w:numPr>
+          <w:ilvl w:val="0"/>
+          <w:numId w:val="2"/>
+        </w:numPr>
+        <w:spacing w:after="40" w:before="40"/>
+      </w:pPr>
+      <w:r>
+        <w:rPr>
+          <w:rFonts w:ascii="Calibri" w:cs="Calibri" w:eastAsia="Calibri" w:hAnsi="Calibri"/>
+          <w:sz w:val="22"/>
+          <w:szCs w:val="22"/>
+        </w:rPr>
+        <w:t xml:space="preserve">Grossmengen-Periode für Performance-Messungen</w:t>
       </w:r>
     </w:p>
     <w:p>
@@ -1622,7 +1553,7 @@
           <w:sz w:val="22"/>
           <w:szCs w:val="22"/>
         </w:rPr>
-        <w:t xml:space="preserve">Primaer Bestandsdaten aus der gemeinsamen Entwicklungsdatenbank. Eigene synthetische Belege werden ausschliesslich in unserer Sandbox erzeugt; ein Demo-Seed-Skript deckt die Hauptfaelle ab.</w:t>
+        <w:t xml:space="preserve">Primär Bestandsdaten aus der gemeinsamen Entwicklungsdatenbank. Eigene synthetische Belege werden ausschliesslich in unserer Sandbox erzeugt; ein Demo-Seed-Skript deckt die Hauptfälle ab.</w:t>
       </w:r>
     </w:p>
     <w:p>
@@ -1656,61 +1587,61 @@
           <w:sz w:val="22"/>
           <w:szCs w:val="22"/>
         </w:rPr>
-        <w:t xml:space="preserve">Eigene Sandbox-Datenbank fuer Unit-Tests und manuelle Pruefungen.</w:t>
-      </w:r>
-    </w:p>
-    <w:p>
-      <w:pPr>
-        <w:pStyle w:val="ListParagraph"/>
-        <w:numPr>
-          <w:ilvl w:val="0"/>
-          <w:numId w:val="2"/>
-        </w:numPr>
-        <w:spacing w:after="40" w:before="40"/>
-      </w:pPr>
-      <w:r>
-        <w:rPr>
-          <w:rFonts w:ascii="Calibri" w:cs="Calibri" w:eastAsia="Calibri" w:hAnsi="Calibri"/>
-          <w:sz w:val="22"/>
-          <w:szCs w:val="22"/>
-        </w:rPr>
-        <w:t xml:space="preserve">Gemeinsame Entwicklungsdatenbank fuer Integrationstests mit Nachbargruppen.</w:t>
-      </w:r>
-    </w:p>
-    <w:p>
-      <w:pPr>
-        <w:pStyle w:val="ListParagraph"/>
-        <w:numPr>
-          <w:ilvl w:val="0"/>
-          <w:numId w:val="2"/>
-        </w:numPr>
-        <w:spacing w:after="40" w:before="40"/>
-      </w:pPr>
-      <w:r>
-        <w:rPr>
-          <w:rFonts w:ascii="Calibri" w:cs="Calibri" w:eastAsia="Calibri" w:hAnsi="Calibri"/>
-          <w:sz w:val="22"/>
-          <w:szCs w:val="22"/>
-        </w:rPr>
-        <w:t xml:space="preserve">Streamlit-Frontend lokal, Browser fuer manuelle Pruefung.</w:t>
-      </w:r>
-    </w:p>
-    <w:p>
-      <w:pPr>
-        <w:pStyle w:val="ListParagraph"/>
-        <w:numPr>
-          <w:ilvl w:val="0"/>
-          <w:numId w:val="2"/>
-        </w:numPr>
-        <w:spacing w:after="40" w:before="40"/>
-      </w:pPr>
-      <w:r>
-        <w:rPr>
-          <w:rFonts w:ascii="Calibri" w:cs="Calibri" w:eastAsia="Calibri" w:hAnsi="Calibri"/>
-          <w:sz w:val="22"/>
-          <w:szCs w:val="22"/>
-        </w:rPr>
-        <w:t xml:space="preserve">DEV ist fuehrend; die Sandbox wird an die DEV-Zielstruktur angepasst, nicht umgekehrt.</w:t>
+        <w:t xml:space="preserve">Eigene Sandbox-Datenbank für Unit-Tests und manuelle Prüfungen.</w:t>
+      </w:r>
+    </w:p>
+    <w:p>
+      <w:pPr>
+        <w:pStyle w:val="ListParagraph"/>
+        <w:numPr>
+          <w:ilvl w:val="0"/>
+          <w:numId w:val="2"/>
+        </w:numPr>
+        <w:spacing w:after="40" w:before="40"/>
+      </w:pPr>
+      <w:r>
+        <w:rPr>
+          <w:rFonts w:ascii="Calibri" w:cs="Calibri" w:eastAsia="Calibri" w:hAnsi="Calibri"/>
+          <w:sz w:val="22"/>
+          <w:szCs w:val="22"/>
+        </w:rPr>
+        <w:t xml:space="preserve">Gemeinsame Entwicklungsdatenbank für Integrationstests mit Nachbargruppen.</w:t>
+      </w:r>
+    </w:p>
+    <w:p>
+      <w:pPr>
+        <w:pStyle w:val="ListParagraph"/>
+        <w:numPr>
+          <w:ilvl w:val="0"/>
+          <w:numId w:val="2"/>
+        </w:numPr>
+        <w:spacing w:after="40" w:before="40"/>
+      </w:pPr>
+      <w:r>
+        <w:rPr>
+          <w:rFonts w:ascii="Calibri" w:cs="Calibri" w:eastAsia="Calibri" w:hAnsi="Calibri"/>
+          <w:sz w:val="22"/>
+          <w:szCs w:val="22"/>
+        </w:rPr>
+        <w:t xml:space="preserve">Streamlit-Frontend lokal, Browser für manuelle Prüfung.</w:t>
+      </w:r>
+    </w:p>
+    <w:p>
+      <w:pPr>
+        <w:pStyle w:val="ListParagraph"/>
+        <w:numPr>
+          <w:ilvl w:val="0"/>
+          <w:numId w:val="2"/>
+        </w:numPr>
+        <w:spacing w:after="40" w:before="40"/>
+      </w:pPr>
+      <w:r>
+        <w:rPr>
+          <w:rFonts w:ascii="Calibri" w:cs="Calibri" w:eastAsia="Calibri" w:hAnsi="Calibri"/>
+          <w:sz w:val="22"/>
+          <w:szCs w:val="22"/>
+        </w:rPr>
+        <w:t xml:space="preserve">DEV ist führend; die Sandbox wird an die DEV-Zielstruktur angepasst, nicht umgekehrt.</w:t>
       </w:r>
     </w:p>
     <w:p>
@@ -1726,7 +1657,7 @@
           <w:sz w:val="32"/>
           <w:szCs w:val="32"/>
         </w:rPr>
-        <w:t xml:space="preserve">6. Testdurchfuehrung</w:t>
+        <w:t xml:space="preserve">6. Testdurchführung</w:t>
       </w:r>
     </w:p>
     <w:p>
@@ -1832,7 +1763,7 @@
           <w:sz w:val="22"/>
           <w:szCs w:val="22"/>
         </w:rPr>
-        <w:t xml:space="preserve">Regressionslauf vor der Praesentation.</w:t>
+        <w:t xml:space="preserve">Regressionslauf vor der Präsentation.</w:t>
       </w:r>
     </w:p>
     <w:p>
@@ -1866,7 +1797,7 @@
           <w:sz w:val="22"/>
           <w:szCs w:val="22"/>
         </w:rPr>
-        <w:t xml:space="preserve">Testfaelle im Repo (Markdown), pflegbar im Git.</w:t>
+        <w:t xml:space="preserve">Testfälle im Repo (Markdown), pflegbar im Git.</w:t>
       </w:r>
     </w:p>
     <w:p>
@@ -1954,61 +1885,61 @@
           <w:sz w:val="22"/>
           <w:szCs w:val="22"/>
         </w:rPr>
-        <w:t xml:space="preserve">Belege werden dem richtigen Monat zugeordnet, vollstaendig erfasst und revisionssicher gespeichert.</w:t>
-      </w:r>
-    </w:p>
-    <w:p>
-      <w:pPr>
-        <w:pStyle w:val="ListParagraph"/>
-        <w:numPr>
-          <w:ilvl w:val="0"/>
-          <w:numId w:val="2"/>
-        </w:numPr>
-        <w:spacing w:after="40" w:before="40"/>
-      </w:pPr>
-      <w:r>
-        <w:rPr>
-          <w:rFonts w:ascii="Calibri" w:cs="Calibri" w:eastAsia="Calibri" w:hAnsi="Calibri"/>
-          <w:sz w:val="22"/>
-          <w:szCs w:val="22"/>
-        </w:rPr>
-        <w:t xml:space="preserve">Zahllast und Vorsteuerueberhang werden konsistent nach der vereinbarten Konvention berechnet.</w:t>
-      </w:r>
-    </w:p>
-    <w:p>
-      <w:pPr>
-        <w:pStyle w:val="ListParagraph"/>
-        <w:numPr>
-          <w:ilvl w:val="0"/>
-          <w:numId w:val="2"/>
-        </w:numPr>
-        <w:spacing w:after="40" w:before="40"/>
-      </w:pPr>
-      <w:r>
-        <w:rPr>
-          <w:rFonts w:ascii="Calibri" w:cs="Calibri" w:eastAsia="Calibri" w:hAnsi="Calibri"/>
-          <w:sz w:val="22"/>
-          <w:szCs w:val="22"/>
-        </w:rPr>
-        <w:t xml:space="preserve">Eine abgeschlossene Abrechnung bleibt unveraenderlich.</w:t>
-      </w:r>
-    </w:p>
-    <w:p>
-      <w:pPr>
-        <w:pStyle w:val="ListParagraph"/>
-        <w:numPr>
-          <w:ilvl w:val="0"/>
-          <w:numId w:val="2"/>
-        </w:numPr>
-        <w:spacing w:after="40" w:before="40"/>
-      </w:pPr>
-      <w:r>
-        <w:rPr>
-          <w:rFonts w:ascii="Calibri" w:cs="Calibri" w:eastAsia="Calibri" w:hAnsi="Calibri"/>
-          <w:sz w:val="22"/>
-          <w:szCs w:val="22"/>
-        </w:rPr>
-        <w:t xml:space="preserve">Statuswechsel werden rollenrichtig durchgefuehrt.</w:t>
+        <w:t xml:space="preserve">Belege werden dem richtigen Monat zugeordnet, vollständig erfasst und revisionssicher gespeichert.</w:t>
+      </w:r>
+    </w:p>
+    <w:p>
+      <w:pPr>
+        <w:pStyle w:val="ListParagraph"/>
+        <w:numPr>
+          <w:ilvl w:val="0"/>
+          <w:numId w:val="2"/>
+        </w:numPr>
+        <w:spacing w:after="40" w:before="40"/>
+      </w:pPr>
+      <w:r>
+        <w:rPr>
+          <w:rFonts w:ascii="Calibri" w:cs="Calibri" w:eastAsia="Calibri" w:hAnsi="Calibri"/>
+          <w:sz w:val="22"/>
+          <w:szCs w:val="22"/>
+        </w:rPr>
+        <w:t xml:space="preserve">Zahllast und Vorsteuerüberhang werden konsistent nach der vereinbarten Konvention berechnet.</w:t>
+      </w:r>
+    </w:p>
+    <w:p>
+      <w:pPr>
+        <w:pStyle w:val="ListParagraph"/>
+        <w:numPr>
+          <w:ilvl w:val="0"/>
+          <w:numId w:val="2"/>
+        </w:numPr>
+        <w:spacing w:after="40" w:before="40"/>
+      </w:pPr>
+      <w:r>
+        <w:rPr>
+          <w:rFonts w:ascii="Calibri" w:cs="Calibri" w:eastAsia="Calibri" w:hAnsi="Calibri"/>
+          <w:sz w:val="22"/>
+          <w:szCs w:val="22"/>
+        </w:rPr>
+        <w:t xml:space="preserve">Eine abgeschlossene Abrechnung bleibt unveränderlich.</w:t>
+      </w:r>
+    </w:p>
+    <w:p>
+      <w:pPr>
+        <w:pStyle w:val="ListParagraph"/>
+        <w:numPr>
+          <w:ilvl w:val="0"/>
+          <w:numId w:val="2"/>
+        </w:numPr>
+        <w:spacing w:after="40" w:before="40"/>
+      </w:pPr>
+      <w:r>
+        <w:rPr>
+          <w:rFonts w:ascii="Calibri" w:cs="Calibri" w:eastAsia="Calibri" w:hAnsi="Calibri"/>
+          <w:sz w:val="22"/>
+          <w:szCs w:val="22"/>
+        </w:rPr>
+        <w:t xml:space="preserve">Statuswechsel werden rollenrichtig durchgeführt.</w:t>
       </w:r>
     </w:p>
     <w:p>
@@ -2044,7 +1975,7 @@
           <w:sz w:val="22"/>
           <w:szCs w:val="22"/>
         </w:rPr>
-        <w:t xml:space="preserve">Performance-Ziel fuer die Anlage einer Abrechnung ist erreicht.</w:t>
+        <w:t xml:space="preserve">Performance-Ziel für die Anlage einer Abrechnung ist erreicht.</w:t>
       </w:r>
     </w:p>
     <w:p>
@@ -2206,7 +2137,7 @@
                 <w:sz w:val="20"/>
                 <w:szCs w:val="20"/>
               </w:rPr>
-              <w:t xml:space="preserve">Schnittstellen von Nachbargruppen aendern sich noch</w:t>
+              <w:t xml:space="preserve">Schnittstellen von Nachbargruppen ändern sich noch</w:t>
             </w:r>
           </w:p>
         </w:tc>
@@ -2235,7 +2166,7 @@
                 <w:sz w:val="20"/>
                 <w:szCs w:val="20"/>
               </w:rPr>
-              <w:t xml:space="preserve">Lese-Views kapseln Schnittstellen. Aenderungen werden lokal in der View nachgezogen.</w:t>
+              <w:t xml:space="preserve">Lese-Views kapseln Schnittstellen. Änderungen werden lokal in der View nachgezogen.</w:t>
             </w:r>
           </w:p>
         </w:tc>
@@ -2295,7 +2226,7 @@
                 <w:sz w:val="20"/>
                 <w:szCs w:val="20"/>
               </w:rPr>
-              <w:t xml:space="preserve">Skonto wird nur aktiviert, wenn die noetigen Felder vorhanden sind. Storno wird als offen markiert und nicht implizit abgenommen.</w:t>
+              <w:t xml:space="preserve">Skonto wird nur aktiviert, wenn die nötigen Felder vorhanden sind. Storno wird als offen markiert und nicht implizit abgenommen.</w:t>
             </w:r>
           </w:p>
         </w:tc>
@@ -2355,7 +2286,7 @@
                 <w:sz w:val="20"/>
                 <w:szCs w:val="20"/>
               </w:rPr>
-              <w:t xml:space="preserve">Setup-Skripte fruehzeitig fertigstellen und einreichen; Tests laufen parallel in der Sandbox.</w:t>
+              <w:t xml:space="preserve">Setup-Skripte frühzeitig fertigstellen und einreichen; Tests laufen parallel in der Sandbox.</w:t>
             </w:r>
           </w:p>
         </w:tc>
@@ -2415,7 +2346,7 @@
                 <w:sz w:val="20"/>
                 <w:szCs w:val="20"/>
               </w:rPr>
-              <w:t xml:space="preserve">Index- und Plan-Review vor der Praesentation.</w:t>
+              <w:t xml:space="preserve">Index- und Plan-Review vor der Präsentation.</w:t>
             </w:r>
           </w:p>
         </w:tc>
@@ -2446,7 +2377,7 @@
                 <w:sz w:val="20"/>
                 <w:szCs w:val="20"/>
               </w:rPr>
-              <w:t xml:space="preserve">Missverstaendnis beim Vorzeichen von Zahllast und Ueberhang</w:t>
+              <w:t xml:space="preserve">Missverständnis beim Vorzeichen von Zahllast und Überhang</w:t>
             </w:r>
           </w:p>
         </w:tc>
@@ -2535,7 +2466,7 @@
                 <w:sz w:val="20"/>
                 <w:szCs w:val="20"/>
               </w:rPr>
-              <w:t xml:space="preserve">Periodenpruefung mit harten Tests abgesichert; Hinweis in der UI.</w:t>
+              <w:t xml:space="preserve">Periodenprüfung mit harten Tests abgesichert; Hinweis in der UI.</w:t>
             </w:r>
           </w:p>
         </w:tc>
@@ -2567,7 +2498,7 @@
           <w:sz w:val="22"/>
           <w:szCs w:val="22"/>
         </w:rPr>
-        <w:t xml:space="preserve">Folgende Bereiche sind bewusst nicht Bestandteil der Abnahme in MS5. Sie werden mit Vorbedingung gefuehrt und scharfgeschaltet, sobald die jeweilige Schnittstelle final geklaert ist:</w:t>
+        <w:t xml:space="preserve">Folgende Bereiche sind bewusst nicht Bestandteil der Abnahme in MS5. Sie werden mit Vorbedingung geführt und scharfgeschaltet, sobald die jeweilige Schnittstelle final geklärt ist:</w:t>
       </w:r>
     </w:p>
     <w:p>
@@ -2603,7 +2534,7 @@
           <w:sz w:val="22"/>
           <w:szCs w:val="22"/>
         </w:rPr>
-        <w:t xml:space="preserve">Finale Vorsteuerquelle von Gruppe 4 (gepruefter Steuerbetrag oder weiterhin Aggregation aus Positionen).</w:t>
+        <w:t xml:space="preserve">Finale Vorsteuerquelle von Gruppe 4 (geprüfter Steuerbetrag oder weiterhin Aggregation aus Positionen).</w:t>
       </w:r>
     </w:p>
     <w:p>
@@ -2675,25 +2606,25 @@
           <w:sz w:val="22"/>
           <w:szCs w:val="22"/>
         </w:rPr>
-        <w:t xml:space="preserve">Bestaetigung der finalen Status-Codes durch den Architekten.</w:t>
-      </w:r>
-    </w:p>
-    <w:p>
-      <w:pPr>
-        <w:pStyle w:val="ListParagraph"/>
-        <w:numPr>
-          <w:ilvl w:val="0"/>
-          <w:numId w:val="2"/>
-        </w:numPr>
-        <w:spacing w:after="40" w:before="40"/>
-      </w:pPr>
-      <w:r>
-        <w:rPr>
-          <w:rFonts w:ascii="Calibri" w:cs="Calibri" w:eastAsia="Calibri" w:hAnsi="Calibri"/>
-          <w:sz w:val="22"/>
-          <w:szCs w:val="22"/>
-        </w:rPr>
-        <w:t xml:space="preserve">Endgueltige Benennung des Abschluss-Status (PAID gegenueber neutraleren Begriffen).</w:t>
+        <w:t xml:space="preserve">Bestätigung der finalen Status-Codes durch den Architekten.</w:t>
+      </w:r>
+    </w:p>
+    <w:p>
+      <w:pPr>
+        <w:pStyle w:val="ListParagraph"/>
+        <w:numPr>
+          <w:ilvl w:val="0"/>
+          <w:numId w:val="2"/>
+        </w:numPr>
+        <w:spacing w:after="40" w:before="40"/>
+      </w:pPr>
+      <w:r>
+        <w:rPr>
+          <w:rFonts w:ascii="Calibri" w:cs="Calibri" w:eastAsia="Calibri" w:hAnsi="Calibri"/>
+          <w:sz w:val="22"/>
+          <w:szCs w:val="22"/>
+        </w:rPr>
+        <w:t xml:space="preserve">Endgültige Benennung des Abschluss-Status (PAID gegenüber neutraleren Begriffen).</w:t>
       </w:r>
     </w:p>
     <w:sectPr>

</xml_diff>

<commit_message>
docs(konzepte): Abgabe-Fassung - ss durch ß ersetzen wo orthografisch korrekt
Konsistent zur Intern-Fassung, in der ß bereits durchgaengig verwendet
wird, jetzt auch in der Abgabe-Fassung. Betroffene Stellen (langer Vokal
oder Diphthong vor s):

- gemaess  -> gemäß
- einfliessen / fliesst  -> einfließen / fließt
- grosse / Grossmengen  -> große / Großmengen
- ausschliesslich  -> ausschließlich
- Gegenmassnahme(n)  -> Gegenmaßnahme(n)

Unveraendert (kurzer Vokal vor ss, korrekt nach neuer Rechtschreibung):
dass, muss, müssen, Abschluss, bewusst, lassen, messen, angepasst,
erfasst, Pass, Klasse-Ableitungen, Missverstaendnis, Berechnungs-
ergebnisse usw.
</commit_message>
<xml_diff>
--- a/docs/konzepte/MS5_Testkonzept_G15_Abgabe.docx
+++ b/docs/konzepte/MS5_Testkonzept_G15_Abgabe.docx
@@ -110,7 +110,7 @@
           <w:sz w:val="22"/>
           <w:szCs w:val="22"/>
         </w:rPr>
-        <w:t xml:space="preserve">Zahllast und Vorsteuerüberhang gemäss unserer Konvention nachvollziehbar berechnet werden,</w:t>
+        <w:t xml:space="preserve">Zahllast und Vorsteuerüberhang gemäß unserer Konvention nachvollziehbar berechnet werden,</w:t>
       </w:r>
     </w:p>
     <w:p>
@@ -146,7 +146,7 @@
           <w:sz w:val="22"/>
           <w:szCs w:val="22"/>
         </w:rPr>
-        <w:t xml:space="preserve">Skonto- und Korrekturfälle, soweit von den Partnergruppen geliefert, periodenrichtig einfliessen,</w:t>
+        <w:t xml:space="preserve">Skonto- und Korrekturfälle, soweit von den Partnergruppen geliefert, periodenrichtig einfließen,</w:t>
       </w:r>
     </w:p>
     <w:p>
@@ -747,7 +747,7 @@
           <w:sz w:val="22"/>
           <w:szCs w:val="22"/>
         </w:rPr>
-        <w:t xml:space="preserve">Späte Korrektur durch eine Zahlung mit Skonto fliesst in die nächste offene Periode.</w:t>
+        <w:t xml:space="preserve">Späte Korrektur durch eine Zahlung mit Skonto fließt in die nächste offene Periode.</w:t>
       </w:r>
     </w:p>
     <w:p>
@@ -894,7 +894,7 @@
           <w:sz w:val="22"/>
           <w:szCs w:val="22"/>
         </w:rPr>
-        <w:t xml:space="preserve">Sehr grosse Beleganzahl (mehrere tausend Items)</w:t>
+        <w:t xml:space="preserve">Sehr große Beleganzahl (mehrere tausend Items)</w:t>
       </w:r>
     </w:p>
     <w:p>
@@ -1524,7 +1524,7 @@
           <w:sz w:val="22"/>
           <w:szCs w:val="22"/>
         </w:rPr>
-        <w:t xml:space="preserve">Grossmengen-Periode für Performance-Messungen</w:t>
+        <w:t xml:space="preserve">Großmengen-Periode für Performance-Messungen</w:t>
       </w:r>
     </w:p>
     <w:p>
@@ -1553,7 +1553,7 @@
           <w:sz w:val="22"/>
           <w:szCs w:val="22"/>
         </w:rPr>
-        <w:t xml:space="preserve">Primär Bestandsdaten aus der gemeinsamen Entwicklungsdatenbank. Eigene synthetische Belege werden ausschliesslich in unserer Sandbox erzeugt; ein Demo-Seed-Skript deckt die Hauptfälle ab.</w:t>
+        <w:t xml:space="preserve">Primär Bestandsdaten aus der gemeinsamen Entwicklungsdatenbank. Eigene synthetische Belege werden ausschließlich in unserer Sandbox erzeugt; ein Demo-Seed-Skript deckt die Hauptfälle ab.</w:t>
       </w:r>
     </w:p>
     <w:p>
@@ -2027,7 +2027,7 @@
           <w:sz w:val="32"/>
           <w:szCs w:val="32"/>
         </w:rPr>
-        <w:t xml:space="preserve">8. Risiken &amp; Gegenmassnahmen</w:t>
+        <w:t xml:space="preserve">8. Risiken &amp; Gegenmaßnahmen</w:t>
       </w:r>
     </w:p>
     <w:tbl>
@@ -2106,7 +2106,7 @@
                 <w:sz w:val="20"/>
                 <w:szCs w:val="20"/>
               </w:rPr>
-              <w:t xml:space="preserve">Gegenmassnahme</w:t>
+              <w:t xml:space="preserve">Gegenmaßnahme</w:t>
             </w:r>
           </w:p>
         </w:tc>

</xml_diff>